<commit_message>
court(miss): petition-for-rehearing footnote clearance 7.5 settles Word's footnote area (p3/p4); docx still reported for one line fit no docx_bias settles (fb-595.54.51)
Co-Authored-By: Claude Opus 5.5 <noreply@anthropic.com>
</commit_message>
<xml_diff>
--- a/courts/fifth-circuit/mississippi/state/supreme-court/petition-for-rehearing/usage/OUTPUT-petition-for-rehearing.docx
+++ b/courts/fifth-circuit/mississippi/state/supreme-court/petition-for-rehearing/usage/OUTPUT-petition-for-rehearing.docx
@@ -1129,7 +1129,7 @@
         <w:t xml:space="preserve"> </w:t>
       </w:r>
       <w:r>
-        <w:t xml:space="preserve">N.M. 325, 328 (2007) (“In this case, the undisputed facts show that Defendant did not bring contraband into the [jail]; law enforcement brought him and the contraband in his possession into the facility. . . . The dispositive issue is that Defendant cannot be held liable for bringing contraband into a jail when he did not do so voluntarily.”). So did the</w:t>
+        <w:t xml:space="preserve">N.M. 325, 328 (2007) (“In this case, the undisputed facts show that Defendant did not bring contraband into the [jail]; law enforcement brought him and the contraband in his possession into the facility. ⁠. ⁠. ⁠. The dispositive issue is that Defendant cannot be held liable for bringing contraband into a jail when he did not do so voluntarily.”). So did the</w:t>
       </w:r>
       <w:r>
         <w:t xml:space="preserve"> </w:t>
@@ -2029,7 +2029,7 @@
         <w:t xml:space="preserve"> </w:t>
       </w:r>
       <w:r>
-        <w:t xml:space="preserve">both capital and noncapital cases . . . .”) (citation omitted). Justice Kennedy’s opinion acknowledged that “[t]hough our decisions recognize a proportionality principle, its precise contours are unclear. This is so in part because we have applied the rule in few</w:t>
+        <w:t xml:space="preserve">both capital and noncapital cases ⁠. ⁠. ⁠. ⁠.”) (citation omitted). Justice Kennedy’s opinion acknowledged that “[t]hough our decisions recognize a proportionality principle, its precise contours are unclear. This is so in part because we have applied the rule in few</w:t>
       </w:r>
       <w:r>
         <w:t xml:space="preserve"> </w:t>
@@ -2261,7 +2261,7 @@
         <w:t xml:space="preserve"> </w:t>
       </w:r>
       <w:r>
-        <w:t xml:space="preserve">gravity of the offense and the harshness of the penalty. . . . Second, it may be helpful to compare the sentences imposed on other criminals in the same jurisdiction. . . . Third, courts may find it useful to compare the sentences imposed for commission of the same</w:t>
+        <w:t xml:space="preserve">gravity of the offense and the harshness of the penalty. ⁠. ⁠. ⁠. Second, it may be helpful to compare the sentences imposed on other criminals in the same jurisdiction. ⁠. ⁠. ⁠. Third, courts may find it useful to compare the sentences imposed for commission of the same</w:t>
       </w:r>
       <w:r>
         <w:t xml:space="preserve"> </w:t>
@@ -2989,7 +2989,7 @@
         <w:t xml:space="preserve"> </w:t>
       </w:r>
       <w:r>
-        <w:t xml:space="preserve">correctional facility). The other two states are Arkansas and Illinois, and both are distinguishable in critical respects. In Illinois, possessing a cell phone in jail is punishable by up to 15 years, but Illinois law establishes an affirmative defense where “the person . . . possessing contraband in a penal institution had been arrested, and that person possessed the contraband at the time of his or her arrest, and that the contraband was . . . possessed in the penal institution by that person as a direct and immediate result of his or her arrest.” 720 Ill. Comp. Stat. 5/31A</w:t>
+        <w:t xml:space="preserve">correctional facility). The other two states are Arkansas and Illinois, and both are distinguishable in critical respects. In Illinois, possessing a cell phone in jail is punishable by up to 15 years, but Illinois law establishes an affirmative defense where “the person ⁠. ⁠. ⁠. possessing contraband in a penal institution had been arrested, and that person possessed the contraband at the time of his or her arrest, and that the contraband was ⁠. ⁠. ⁠. possessed in the penal institution by that person as a direct and immediate result of his or her arrest.” 720 Ill. Comp. Stat. 5/31A</w:t>
       </w:r>
       <w:r>
         <w:noBreakHyphen/>
@@ -3215,7 +3215,7 @@
         <w:t xml:space="preserve"> </w:t>
       </w:r>
       <w:r>
-        <w:t xml:space="preserve">(“That is not to say that a proportionality principle would not come into play . . . if a legislature made overtime parking a felony punishable by life imprisonment.”).</w:t>
+        <w:t xml:space="preserve">(“That is not to say that a proportionality principle would not come into play ⁠. ⁠. ⁠. if a legislature made overtime parking a felony punishable by life imprisonment.”).</w:t>
       </w:r>
     </w:p>
     <w:p>
@@ -3689,7 +3689,7 @@
           <w:i/>
           <w:iCs/>
         </w:rPr>
-        <w:t xml:space="preserve">imposed leads to an inference of ‘gross disproportionality.’ Based on Harmelin, . . . only</w:t>
+        <w:t xml:space="preserve">imposed leads to an inference of ‘gross disproportionality.’ Based on Harmelin, ⁠. ⁠. ⁠. only</w:t>
       </w:r>
       <w:r>
         <w:t xml:space="preserve"> </w:t>
@@ -5141,7 +5141,7 @@
         <w:pStyle w:val="BodyText"/>
       </w:pPr>
       <w:r>
-        <w:t xml:space="preserve">First, as a matter of substance, a punishment can be quite cruel though often imposed to the point where it may not be said unusual. . . . Second, the draftsmen of the Mississippi Constitution had available the text of the Eighth Amendment. The Mississippi draftsmen were presumably aware of the Eighth Amendment’s conjunctive prescription that a punishment must be both cruel and unusual before a violation has occurred. In this context, the disjunctive ‘or’ in section 28 should be regarded as purposeful choice made by the constitutional draftsmen and enforced as such. Encyclopedia of Mississippi Law § 19:115 (Right to Be Free from Cruel or Unusual Punishments).</w:t>
+        <w:t xml:space="preserve">First, as a matter of substance, a punishment can be quite cruel though often imposed to the point where it may not be said unusual. ⁠. ⁠. ⁠. Second, the draftsmen of the Mississippi Constitution had available the text of the Eighth Amendment. The Mississippi draftsmen were presumably aware of the Eighth Amendment’s conjunctive prescription that a punishment must be both cruel and unusual before a violation has occurred. In this context, the disjunctive ‘or’ in section 28 should be regarded as purposeful choice made by the constitutional draftsmen and enforced as such. Encyclopedia of Mississippi Law § 19:115 (Right to Be Free from Cruel or Unusual Punishments).</w:t>
       </w:r>
     </w:p>
     <w:p>
@@ -7287,13 +7287,7 @@
         <w:t xml:space="preserve"> </w:t>
       </w:r>
       <w:r>
-        <w:t xml:space="preserve">https://​metro.​co.​uk/​2020/​01/​21/​prisoner-​gets</w:t>
-      </w:r>
-      <w:r>
-        <w:noBreakHyphen/>
-      </w:r>
-      <w:r>
-        <w:t xml:space="preserve">12-​year-​sentence-​asking-​guard- charge-phone</w:t>
+        <w:t xml:space="preserve">https://​metro.​co.​uk/​2020/​01/​21/​prisoner-​gets-⁠12-​year-​sentence-​asking-​guard- charge-phone</w:t>
       </w:r>
       <w:r>
         <w:noBreakHyphen/>
@@ -7318,7 +7312,7 @@
         <w:t xml:space="preserve"> </w:t>
       </w:r>
       <w:r>
-        <w:t xml:space="preserve">Miss. Code Ann. § 47-⁠5-⁠193 (“It is unlawful for any person or offender to take, attempt to take, or assist in taking any weapon, deadly weapon, unauthorized electronic device, contraband item, cell phone or any of its components or accessories . . . on property within the state belonging to the department, a county, a municipality, or other entity that is occupied or used by offenders, except as authorized by law.”).</w:t>
+        <w:t xml:space="preserve">Miss. Code Ann. § 47-⁠5-⁠193 (“It is unlawful for any person or offender to take, attempt to take, or assist in taking any weapon, deadly weapon, unauthorized electronic device, contraband item, cell phone or any of its components or accessories ⁠. ⁠. ⁠. on property within the state belonging to the department, a county, a municipality, or other entity that is occupied or used by offenders, except as authorized by law.”).</w:t>
       </w:r>
     </w:p>
   </w:footnote>

</xml_diff>